<commit_message>
v5.13.1: Updated Processor help
</commit_message>
<xml_diff>
--- a/Help/PROCESSOR_Help.docx
+++ b/Help/PROCESSOR_Help.docx
@@ -1,6 +1,6 @@
 
 <file path=word/document.xml><?xml version="1.0" encoding="utf-8"?>
-<w:document xmlns:wpc="http://schemas.microsoft.com/office/word/2010/wordprocessingCanvas" xmlns:cx="http://schemas.microsoft.com/office/drawing/2014/chartex" xmlns:cx1="http://schemas.microsoft.com/office/drawing/2015/9/8/chartex" xmlns:cx2="http://schemas.microsoft.com/office/drawing/2015/10/21/chartex" xmlns:cx3="http://schemas.microsoft.com/office/drawing/2016/5/9/chartex" xmlns:cx4="http://schemas.microsoft.com/office/drawing/2016/5/10/chartex" xmlns:cx5="http://schemas.microsoft.com/office/drawing/2016/5/11/chartex" xmlns:cx6="http://schemas.microsoft.com/office/drawing/2016/5/12/chartex" xmlns:cx7="http://schemas.microsoft.com/office/drawing/2016/5/13/chartex" xmlns:cx8="http://schemas.microsoft.com/office/drawing/2016/5/14/chartex" xmlns:mc="http://schemas.openxmlformats.org/markup-compatibility/2006" xmlns:aink="http://schemas.microsoft.com/office/drawing/2016/ink" xmlns:am3d="http://schemas.microsoft.com/office/drawing/2017/model3d" xmlns:o="urn:schemas-microsoft-com:office:office" xmlns:r="http://schemas.openxmlformats.org/officeDocument/2006/relationships" xmlns:m="http://schemas.openxmlformats.org/officeDocument/2006/math" xmlns:v="urn:schemas-microsoft-com:vml" xmlns:wp14="http://schemas.microsoft.com/office/word/2010/wordprocessingDrawing" xmlns:wp="http://schemas.openxmlformats.org/drawingml/2006/wordprocessingDrawing" xmlns:w10="urn:schemas-microsoft-com:office:word" xmlns:w="http://schemas.openxmlformats.org/wordprocessingml/2006/main" xmlns:w14="http://schemas.microsoft.com/office/word/2010/wordml" xmlns:w15="http://schemas.microsoft.com/office/word/2012/wordml" xmlns:w16cid="http://schemas.microsoft.com/office/word/2016/wordml/cid" xmlns:w16se="http://schemas.microsoft.com/office/word/2015/wordml/symex" xmlns:wpg="http://schemas.microsoft.com/office/word/2010/wordprocessingGroup" xmlns:wpi="http://schemas.microsoft.com/office/word/2010/wordprocessingInk" xmlns:wne="http://schemas.microsoft.com/office/word/2006/wordml" xmlns:wps="http://schemas.microsoft.com/office/word/2010/wordprocessingShape" mc:Ignorable="w14 w15 w16se w16cid wp14">
+<w:document xmlns:wpc="http://schemas.microsoft.com/office/word/2010/wordprocessingCanvas" xmlns:cx="http://schemas.microsoft.com/office/drawing/2014/chartex" xmlns:cx1="http://schemas.microsoft.com/office/drawing/2015/9/8/chartex" xmlns:cx2="http://schemas.microsoft.com/office/drawing/2015/10/21/chartex" xmlns:cx3="http://schemas.microsoft.com/office/drawing/2016/5/9/chartex" xmlns:cx4="http://schemas.microsoft.com/office/drawing/2016/5/10/chartex" xmlns:cx5="http://schemas.microsoft.com/office/drawing/2016/5/11/chartex" xmlns:cx6="http://schemas.microsoft.com/office/drawing/2016/5/12/chartex" xmlns:cx7="http://schemas.microsoft.com/office/drawing/2016/5/13/chartex" xmlns:cx8="http://schemas.microsoft.com/office/drawing/2016/5/14/chartex" xmlns:mc="http://schemas.openxmlformats.org/markup-compatibility/2006" xmlns:aink="http://schemas.microsoft.com/office/drawing/2016/ink" xmlns:am3d="http://schemas.microsoft.com/office/drawing/2017/model3d" xmlns:o="urn:schemas-microsoft-com:office:office" xmlns:oel="http://schemas.microsoft.com/office/2019/extlst" xmlns:r="http://schemas.openxmlformats.org/officeDocument/2006/relationships" xmlns:m="http://schemas.openxmlformats.org/officeDocument/2006/math" xmlns:v="urn:schemas-microsoft-com:vml" xmlns:wp14="http://schemas.microsoft.com/office/word/2010/wordprocessingDrawing" xmlns:wp="http://schemas.openxmlformats.org/drawingml/2006/wordprocessingDrawing" xmlns:w10="urn:schemas-microsoft-com:office:word" xmlns:w="http://schemas.openxmlformats.org/wordprocessingml/2006/main" xmlns:w14="http://schemas.microsoft.com/office/word/2010/wordml" xmlns:w15="http://schemas.microsoft.com/office/word/2012/wordml" xmlns:w16cex="http://schemas.microsoft.com/office/word/2018/wordml/cex" xmlns:w16cid="http://schemas.microsoft.com/office/word/2016/wordml/cid" xmlns:w16="http://schemas.microsoft.com/office/word/2018/wordml" xmlns:w16du="http://schemas.microsoft.com/office/word/2023/wordml/word16du" xmlns:w16sdtdh="http://schemas.microsoft.com/office/word/2020/wordml/sdtdatahash" xmlns:w16sdtfl="http://schemas.microsoft.com/office/word/2024/wordml/sdtformatlock" xmlns:w16se="http://schemas.microsoft.com/office/word/2015/wordml/symex" xmlns:wpg="http://schemas.microsoft.com/office/word/2010/wordprocessingGroup" xmlns:wpi="http://schemas.microsoft.com/office/word/2010/wordprocessingInk" xmlns:wne="http://schemas.microsoft.com/office/word/2006/wordml" xmlns:wps="http://schemas.microsoft.com/office/word/2010/wordprocessingShape" mc:Ignorable="w14 w15 w16se w16cid w16 w16cex w16sdtdh w16sdtfl w16du wp14">
   <w:body>
     <w:p>
       <w:pPr>
@@ -117,7 +117,7 @@
           </mc:Choice>
           <mc:Fallback>
             <w:pict>
-              <v:rect w14:anchorId="5AEC540C" id="Rectangle 15" o:spid="_x0000_s1026" style="position:absolute;margin-left:407.6pt;margin-top:4.8pt;width:33.2pt;height:25.65pt;z-index:251659264;visibility:visible;mso-wrap-style:square;mso-width-percent:0;mso-height-percent:0;mso-wrap-distance-left:9pt;mso-wrap-distance-top:0;mso-wrap-distance-right:9pt;mso-wrap-distance-bottom:0;mso-position-horizontal:absolute;mso-position-horizontal-relative:text;mso-position-vertical:absolute;mso-position-vertical-relative:text;mso-width-percent:0;mso-height-percent:0;mso-width-relative:margin;mso-height-relative:margin;v-text-anchor:middle" o:gfxdata="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" filled="f" strokecolor="white [3212]" strokeweight="1pt">
+              <v:rect w14:anchorId="5AEC540C" id="Rectangle 15" o:spid="_x0000_s1026" style="position:absolute;margin-left:407.6pt;margin-top:4.8pt;width:33.2pt;height:25.65pt;z-index:251659264;visibility:visible;mso-wrap-style:square;mso-width-percent:0;mso-height-percent:0;mso-wrap-distance-left:9pt;mso-wrap-distance-top:0;mso-wrap-distance-right:9pt;mso-wrap-distance-bottom:0;mso-position-horizontal:absolute;mso-position-horizontal-relative:text;mso-position-vertical:absolute;mso-position-vertical-relative:text;mso-width-percent:0;mso-height-percent:0;mso-width-relative:margin;mso-height-relative:margin;v-text-anchor:middle" o:gfxdata="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" filled="f" strokecolor="white [3212]" strokeweight="1pt">
                 <v:textbox>
                   <w:txbxContent>
                     <w:p>
@@ -1752,7 +1752,47 @@
           <w:sz w:val="22"/>
           <w:szCs w:val="22"/>
         </w:rPr>
-        <w:t xml:space="preserve"> Green Weight Conversion Ratios Exist In The Tree </w:t>
+        <w:t xml:space="preserve"> Green Weight Conversion Ratios Exist </w:t>
+      </w:r>
+      <w:proofErr w:type="gramStart"/>
+      <w:r>
+        <w:rPr>
+          <w:rFonts w:asciiTheme="minorHAnsi" w:hAnsiTheme="minorHAnsi"/>
+          <w:b/>
+          <w:sz w:val="22"/>
+          <w:szCs w:val="22"/>
+        </w:rPr>
+        <w:t>In</w:t>
+      </w:r>
+      <w:proofErr w:type="gramEnd"/>
+      <w:r>
+        <w:rPr>
+          <w:rFonts w:asciiTheme="minorHAnsi" w:hAnsiTheme="minorHAnsi"/>
+          <w:b/>
+          <w:sz w:val="22"/>
+          <w:szCs w:val="22"/>
+        </w:rPr>
+        <w:t xml:space="preserve"> </w:t>
+      </w:r>
+      <w:proofErr w:type="gramStart"/>
+      <w:r>
+        <w:rPr>
+          <w:rFonts w:asciiTheme="minorHAnsi" w:hAnsiTheme="minorHAnsi"/>
+          <w:b/>
+          <w:sz w:val="22"/>
+          <w:szCs w:val="22"/>
+        </w:rPr>
+        <w:t>The</w:t>
+      </w:r>
+      <w:proofErr w:type="gramEnd"/>
+      <w:r>
+        <w:rPr>
+          <w:rFonts w:asciiTheme="minorHAnsi" w:hAnsiTheme="minorHAnsi"/>
+          <w:b/>
+          <w:sz w:val="22"/>
+          <w:szCs w:val="22"/>
+        </w:rPr>
+        <w:t xml:space="preserve"> Tree </w:t>
       </w:r>
       <w:proofErr w:type="spellStart"/>
       <w:r>
@@ -3263,7 +3303,15 @@
       </w:r>
       <w:proofErr w:type="spellEnd"/>
       <w:r>
-        <w:t xml:space="preserve"> by BioSum Processor.  Harvest methods can be assigned within the BioSum FVS module when prescriptions (Rx) are specified, or here, via the Harvest Method fields that, when populated, apply to all treatments in the scenario</w:t>
+        <w:t xml:space="preserve"> by </w:t>
+      </w:r>
+      <w:proofErr w:type="spellStart"/>
+      <w:r>
+        <w:t>BioSum</w:t>
+      </w:r>
+      <w:proofErr w:type="spellEnd"/>
+      <w:r>
+        <w:t xml:space="preserve"> Processor.  Harvest methods can be assigned within the BioSum FVS module when prescriptions (Rx) are specified, or here, via the Harvest Method fields that, when populated, apply to all treatments in the scenario</w:t>
       </w:r>
       <w:r>
         <w:t>.</w:t>
@@ -3401,7 +3449,25 @@
           <w:sz w:val="22"/>
           <w:szCs w:val="22"/>
         </w:rPr>
-        <w:t xml:space="preserve"> text box.  A current list and description of the harvest methods supported by BioSum and </w:t>
+        <w:t xml:space="preserve"> text box.  A current list and description of the harvest methods supported by </w:t>
+      </w:r>
+      <w:proofErr w:type="spellStart"/>
+      <w:r>
+        <w:rPr>
+          <w:rFonts w:asciiTheme="minorHAnsi" w:hAnsiTheme="minorHAnsi"/>
+          <w:sz w:val="22"/>
+          <w:szCs w:val="22"/>
+        </w:rPr>
+        <w:t>BioSum</w:t>
+      </w:r>
+      <w:proofErr w:type="spellEnd"/>
+      <w:r>
+        <w:rPr>
+          <w:rFonts w:asciiTheme="minorHAnsi" w:hAnsiTheme="minorHAnsi"/>
+          <w:sz w:val="22"/>
+          <w:szCs w:val="22"/>
+        </w:rPr>
+        <w:t xml:space="preserve"> and </w:t>
       </w:r>
       <w:proofErr w:type="spellStart"/>
       <w:r>
@@ -3725,7 +3791,25 @@
           <w:sz w:val="22"/>
           <w:szCs w:val="22"/>
         </w:rPr>
-        <w:t xml:space="preserve"> parameter determines how BioSum and </w:t>
+        <w:t xml:space="preserve"> parameter determines how </w:t>
+      </w:r>
+      <w:proofErr w:type="spellStart"/>
+      <w:r>
+        <w:rPr>
+          <w:rFonts w:asciiTheme="minorHAnsi" w:hAnsiTheme="minorHAnsi"/>
+          <w:sz w:val="22"/>
+          <w:szCs w:val="22"/>
+        </w:rPr>
+        <w:t>BioSum</w:t>
+      </w:r>
+      <w:proofErr w:type="spellEnd"/>
+      <w:r>
+        <w:rPr>
+          <w:rFonts w:asciiTheme="minorHAnsi" w:hAnsiTheme="minorHAnsi"/>
+          <w:sz w:val="22"/>
+          <w:szCs w:val="22"/>
+        </w:rPr>
+        <w:t xml:space="preserve"> and </w:t>
       </w:r>
       <w:proofErr w:type="spellStart"/>
       <w:r>
@@ -4392,31 +4476,169 @@
       </w:r>
     </w:p>
     <w:p>
-      <w:pPr>
-        <w:rPr>
-          <w:b/>
-          <w:sz w:val="20"/>
-          <w:szCs w:val="20"/>
-        </w:rPr>
-      </w:pPr>
-      <w:r>
-        <w:t xml:space="preserve">This form provides for entering/revising the merchantable value in dollars per cubic foot, at the mill gate, for each combination of species and diameter group represented in the Processor scenario, and a value in dollars per green ton, at the delivery point (e.g., a biomass-based energy generating facility), for chipped residues (the material chipped at a treatment site and loaded onto a chip truck). The latter should be entered in the field labeled “Energy value for energy wood (chips) in $/green ton”. To allocate a species/diameter group combination to energy wood, use the </w:t>
-      </w:r>
-      <w:r>
-        <w:rPr>
-          <w:b/>
-        </w:rPr>
-        <w:t>Allocate to Energy Wood</w:t>
-      </w:r>
-      <w:r>
-        <w:t xml:space="preserve"> checkbox. Note: if silvicultural sequences are designed to have different thresholds, or wood allocation choices, it is possible to select parameters, and run processor for one set of sequences with one set of wood value parameters, then run another set of sequences with a modified set of parameters</w:t>
-      </w:r>
-      <w:r>
-        <w:rPr>
-          <w:sz w:val="20"/>
-          <w:szCs w:val="20"/>
-        </w:rPr>
-        <w:t xml:space="preserve">. </w:t>
+      <w:r>
+        <w:rPr>
+          <w:b/>
+          <w:bCs/>
+        </w:rPr>
+        <w:t>Prices paid for delivered wood at mill/facility gate</w:t>
+      </w:r>
+      <w:r>
+        <w:t>. Enter or revise delivered wood values and allocation percentages for each species-group and tree-DBH-class combination represented in the Processor scenario.</w:t>
+      </w:r>
+    </w:p>
+    <w:p>
+      <w:r>
+        <w:t>Hog fuel value</w:t>
+      </w:r>
+      <w:r>
+        <w:t>.</w:t>
+      </w:r>
+      <w:r>
+        <w:t xml:space="preserve"> For hog fuel (chipped logging residues), enter the delivered value in dollars per green ton in </w:t>
+      </w:r>
+      <w:r>
+        <w:rPr>
+          <w:b/>
+          <w:bCs/>
+        </w:rPr>
+        <w:t>Hog fuel (chipped logging residues) value ($/green ton)</w:t>
+      </w:r>
+      <w:r>
+        <w:t>. This is the value at the delivery point, such as a biomass energy facility.</w:t>
+      </w:r>
+    </w:p>
+    <w:p>
+      <w:r>
+        <w:t>Wood allocation.</w:t>
+      </w:r>
+      <w:r>
+        <w:t xml:space="preserve"> For each species-group and DBH-class combination, allocate the bole among </w:t>
+      </w:r>
+      <w:r>
+        <w:rPr>
+          <w:b/>
+          <w:bCs/>
+        </w:rPr>
+        <w:t>Pct Hog</w:t>
+      </w:r>
+      <w:r>
+        <w:t xml:space="preserve"> </w:t>
+      </w:r>
+      <w:r>
+        <w:rPr>
+          <w:b/>
+          <w:bCs/>
+        </w:rPr>
+        <w:t>Fuel</w:t>
+      </w:r>
+      <w:r>
+        <w:t xml:space="preserve">, </w:t>
+      </w:r>
+      <w:r>
+        <w:rPr>
+          <w:b/>
+          <w:bCs/>
+        </w:rPr>
+        <w:t>Pct Merch</w:t>
+      </w:r>
+      <w:r>
+        <w:t xml:space="preserve">, </w:t>
+      </w:r>
+      <w:r>
+        <w:rPr>
+          <w:b/>
+          <w:bCs/>
+        </w:rPr>
+        <w:t>Pct Wood4</w:t>
+      </w:r>
+      <w:r>
+        <w:t xml:space="preserve">, </w:t>
+      </w:r>
+      <w:r>
+        <w:rPr>
+          <w:b/>
+          <w:bCs/>
+        </w:rPr>
+        <w:t>Pct Wood5</w:t>
+      </w:r>
+      <w:r>
+        <w:t xml:space="preserve">, and </w:t>
+      </w:r>
+      <w:r>
+        <w:rPr>
+          <w:b/>
+          <w:bCs/>
+        </w:rPr>
+        <w:t>Pct Wood6</w:t>
+      </w:r>
+      <w:r>
+        <w:t xml:space="preserve">. The percentages for a row should total 100. Select </w:t>
+      </w:r>
+      <w:r>
+        <w:rPr>
+          <w:b/>
+          <w:bCs/>
+        </w:rPr>
+        <w:t>Allocate All to Hog Fuel</w:t>
+      </w:r>
+      <w:r>
+        <w:t xml:space="preserve"> to assign the entire combination to hog fuel; the screen then shows 100 percent hog fuel and zero percent for the other wood categories.</w:t>
+      </w:r>
+    </w:p>
+    <w:p>
+      <w:r>
+        <w:t xml:space="preserve">Delivered values for bole wood. Enter the delivered value in </w:t>
+      </w:r>
+      <w:r>
+        <w:rPr>
+          <w:b/>
+          <w:bCs/>
+        </w:rPr>
+        <w:t>dollars per cubic foot</w:t>
+      </w:r>
+      <w:r>
+        <w:t xml:space="preserve"> for each bole-wood category used in the allocation. </w:t>
+      </w:r>
+      <w:r>
+        <w:rPr>
+          <w:b/>
+          <w:bCs/>
+        </w:rPr>
+        <w:t>Merch</w:t>
+      </w:r>
+      <w:r>
+        <w:t xml:space="preserve"> represents merchantable logs delivered to facilities such as lumber and plywood mills. </w:t>
+      </w:r>
+      <w:r>
+        <w:rPr>
+          <w:b/>
+          <w:bCs/>
+        </w:rPr>
+        <w:t>Wood4</w:t>
+      </w:r>
+      <w:r>
+        <w:t xml:space="preserve">, </w:t>
+      </w:r>
+      <w:r>
+        <w:rPr>
+          <w:b/>
+          <w:bCs/>
+        </w:rPr>
+        <w:t>Wood5</w:t>
+      </w:r>
+      <w:r>
+        <w:t xml:space="preserve">, and </w:t>
+      </w:r>
+      <w:r>
+        <w:rPr>
+          <w:b/>
+          <w:bCs/>
+        </w:rPr>
+        <w:t>Wood6</w:t>
+      </w:r>
+      <w:r>
+        <w:t xml:space="preserve"> are the three additional analyst-defined wood categories. Depending on the analysis, these categories can represent products such as pulp logs, posts, pellet stock, pallet stock, or biochar feedstock made from small but clean, debarked wood. Use each category consistently throughout the Processor scenario and Treatment Optimizer.</w:t>
       </w:r>
     </w:p>
     <w:p>
@@ -4425,6 +4647,20 @@
           <w:rFonts w:eastAsia="Times New Roman" w:cs="Times New Roman"/>
         </w:rPr>
       </w:pPr>
+      <w:r>
+        <w:t xml:space="preserve">Future Note: When </w:t>
+      </w:r>
+      <w:proofErr w:type="spellStart"/>
+      <w:r>
+        <w:t>BioSum</w:t>
+      </w:r>
+      <w:proofErr w:type="spellEnd"/>
+      <w:r>
+        <w:t xml:space="preserve"> has the ability to blend Processor scenarios; If silvicultural sequences use different diameter thresholds, allocation choices, or wood values, select and run the Processor for one set of sequences with one set of Wood Value parameters, then run the other sequences with the appropriate modified parameters.</w:t>
+      </w:r>
+      <w:r>
+        <w:t xml:space="preserve"> </w:t>
+      </w:r>
       <w:r>
         <w:br w:type="page"/>
       </w:r>
@@ -4600,8 +4836,6 @@
           <w:t>http://biosum.info/downloads/processor/Escalators.xlsx</w:t>
         </w:r>
       </w:hyperlink>
-      <w:bookmarkStart w:id="0" w:name="_GoBack"/>
-      <w:bookmarkEnd w:id="0"/>
       <w:r>
         <w:rPr>
           <w:rFonts w:ascii="Calibri" w:hAnsi="Calibri" w:cs="Times New Roman"/>
@@ -5431,7 +5665,7 @@
 </file>
 
 <file path=word/numbering.xml><?xml version="1.0" encoding="utf-8"?>
-<w:numbering xmlns:wpc="http://schemas.microsoft.com/office/word/2010/wordprocessingCanvas" xmlns:cx="http://schemas.microsoft.com/office/drawing/2014/chartex" xmlns:cx1="http://schemas.microsoft.com/office/drawing/2015/9/8/chartex" xmlns:cx2="http://schemas.microsoft.com/office/drawing/2015/10/21/chartex" xmlns:cx3="http://schemas.microsoft.com/office/drawing/2016/5/9/chartex" xmlns:cx4="http://schemas.microsoft.com/office/drawing/2016/5/10/chartex" xmlns:cx5="http://schemas.microsoft.com/office/drawing/2016/5/11/chartex" xmlns:cx6="http://schemas.microsoft.com/office/drawing/2016/5/12/chartex" xmlns:cx7="http://schemas.microsoft.com/office/drawing/2016/5/13/chartex" xmlns:cx8="http://schemas.microsoft.com/office/drawing/2016/5/14/chartex" xmlns:mc="http://schemas.openxmlformats.org/markup-compatibility/2006" xmlns:aink="http://schemas.microsoft.com/office/drawing/2016/ink" xmlns:am3d="http://schemas.microsoft.com/office/drawing/2017/model3d" xmlns:o="urn:schemas-microsoft-com:office:office" xmlns:r="http://schemas.openxmlformats.org/officeDocument/2006/relationships" xmlns:m="http://schemas.openxmlformats.org/officeDocument/2006/math" xmlns:v="urn:schemas-microsoft-com:vml" xmlns:wp14="http://schemas.microsoft.com/office/word/2010/wordprocessingDrawing" xmlns:wp="http://schemas.openxmlformats.org/drawingml/2006/wordprocessingDrawing" xmlns:w10="urn:schemas-microsoft-com:office:word" xmlns:w="http://schemas.openxmlformats.org/wordprocessingml/2006/main" xmlns:w14="http://schemas.microsoft.com/office/word/2010/wordml" xmlns:w15="http://schemas.microsoft.com/office/word/2012/wordml" xmlns:w16cid="http://schemas.microsoft.com/office/word/2016/wordml/cid" xmlns:w16se="http://schemas.microsoft.com/office/word/2015/wordml/symex" xmlns:wpg="http://schemas.microsoft.com/office/word/2010/wordprocessingGroup" xmlns:wpi="http://schemas.microsoft.com/office/word/2010/wordprocessingInk" xmlns:wne="http://schemas.microsoft.com/office/word/2006/wordml" xmlns:wps="http://schemas.microsoft.com/office/word/2010/wordprocessingShape" mc:Ignorable="w14 w15 w16se w16cid wp14">
+<w:numbering xmlns:wpc="http://schemas.microsoft.com/office/word/2010/wordprocessingCanvas" xmlns:cx="http://schemas.microsoft.com/office/drawing/2014/chartex" xmlns:cx1="http://schemas.microsoft.com/office/drawing/2015/9/8/chartex" xmlns:cx2="http://schemas.microsoft.com/office/drawing/2015/10/21/chartex" xmlns:cx3="http://schemas.microsoft.com/office/drawing/2016/5/9/chartex" xmlns:cx4="http://schemas.microsoft.com/office/drawing/2016/5/10/chartex" xmlns:cx5="http://schemas.microsoft.com/office/drawing/2016/5/11/chartex" xmlns:cx6="http://schemas.microsoft.com/office/drawing/2016/5/12/chartex" xmlns:cx7="http://schemas.microsoft.com/office/drawing/2016/5/13/chartex" xmlns:cx8="http://schemas.microsoft.com/office/drawing/2016/5/14/chartex" xmlns:mc="http://schemas.openxmlformats.org/markup-compatibility/2006" xmlns:aink="http://schemas.microsoft.com/office/drawing/2016/ink" xmlns:am3d="http://schemas.microsoft.com/office/drawing/2017/model3d" xmlns:o="urn:schemas-microsoft-com:office:office" xmlns:oel="http://schemas.microsoft.com/office/2019/extlst" xmlns:r="http://schemas.openxmlformats.org/officeDocument/2006/relationships" xmlns:m="http://schemas.openxmlformats.org/officeDocument/2006/math" xmlns:v="urn:schemas-microsoft-com:vml" xmlns:wp14="http://schemas.microsoft.com/office/word/2010/wordprocessingDrawing" xmlns:wp="http://schemas.openxmlformats.org/drawingml/2006/wordprocessingDrawing" xmlns:w10="urn:schemas-microsoft-com:office:word" xmlns:w="http://schemas.openxmlformats.org/wordprocessingml/2006/main" xmlns:w14="http://schemas.microsoft.com/office/word/2010/wordml" xmlns:w15="http://schemas.microsoft.com/office/word/2012/wordml" xmlns:w16cex="http://schemas.microsoft.com/office/word/2018/wordml/cex" xmlns:w16cid="http://schemas.microsoft.com/office/word/2016/wordml/cid" xmlns:w16="http://schemas.microsoft.com/office/word/2018/wordml" xmlns:w16du="http://schemas.microsoft.com/office/word/2023/wordml/word16du" xmlns:w16sdtdh="http://schemas.microsoft.com/office/word/2020/wordml/sdtdatahash" xmlns:w16sdtfl="http://schemas.microsoft.com/office/word/2024/wordml/sdtformatlock" xmlns:w16se="http://schemas.microsoft.com/office/word/2015/wordml/symex" xmlns:wpg="http://schemas.microsoft.com/office/word/2010/wordprocessingGroup" xmlns:wpi="http://schemas.microsoft.com/office/word/2010/wordprocessingInk" xmlns:wne="http://schemas.microsoft.com/office/word/2006/wordml" xmlns:wps="http://schemas.microsoft.com/office/word/2010/wordprocessingShape" mc:Ignorable="w14 w15 w16se w16cid w16 w16cex w16sdtdh w16sdtfl w16du wp14">
   <w:abstractNum w:abstractNumId="0" w15:restartNumberingAfterBreak="0">
     <w:nsid w:val="1619034D"/>
     <w:multiLevelType w:val="hybridMultilevel"/>
@@ -6435,44 +6669,44 @@
       </w:pPr>
     </w:lvl>
   </w:abstractNum>
-  <w:num w:numId="1">
+  <w:num w:numId="1" w16cid:durableId="1923295303">
     <w:abstractNumId w:val="9"/>
   </w:num>
-  <w:num w:numId="2">
+  <w:num w:numId="2" w16cid:durableId="2070884993">
     <w:abstractNumId w:val="2"/>
   </w:num>
-  <w:num w:numId="3">
+  <w:num w:numId="3" w16cid:durableId="554780087">
     <w:abstractNumId w:val="0"/>
   </w:num>
-  <w:num w:numId="4">
+  <w:num w:numId="4" w16cid:durableId="428937629">
     <w:abstractNumId w:val="6"/>
   </w:num>
-  <w:num w:numId="5">
+  <w:num w:numId="5" w16cid:durableId="870729048">
     <w:abstractNumId w:val="10"/>
   </w:num>
-  <w:num w:numId="6">
+  <w:num w:numId="6" w16cid:durableId="767313427">
     <w:abstractNumId w:val="3"/>
   </w:num>
-  <w:num w:numId="7">
+  <w:num w:numId="7" w16cid:durableId="1375889857">
     <w:abstractNumId w:val="1"/>
   </w:num>
-  <w:num w:numId="8">
+  <w:num w:numId="8" w16cid:durableId="581455491">
     <w:abstractNumId w:val="8"/>
   </w:num>
-  <w:num w:numId="9">
+  <w:num w:numId="9" w16cid:durableId="249780307">
     <w:abstractNumId w:val="4"/>
   </w:num>
-  <w:num w:numId="10">
+  <w:num w:numId="10" w16cid:durableId="1006635922">
     <w:abstractNumId w:val="7"/>
   </w:num>
-  <w:num w:numId="11">
+  <w:num w:numId="11" w16cid:durableId="294222278">
     <w:abstractNumId w:val="5"/>
   </w:num>
 </w:numbering>
 </file>
 
 <file path=word/styles.xml><?xml version="1.0" encoding="utf-8"?>
-<w:styles xmlns:mc="http://schemas.openxmlformats.org/markup-compatibility/2006" xmlns:r="http://schemas.openxmlformats.org/officeDocument/2006/relationships" xmlns:w="http://schemas.openxmlformats.org/wordprocessingml/2006/main" xmlns:w14="http://schemas.microsoft.com/office/word/2010/wordml" xmlns:w15="http://schemas.microsoft.com/office/word/2012/wordml" xmlns:w16cid="http://schemas.microsoft.com/office/word/2016/wordml/cid" xmlns:w16se="http://schemas.microsoft.com/office/word/2015/wordml/symex" mc:Ignorable="w14 w15 w16se w16cid">
+<w:styles xmlns:mc="http://schemas.openxmlformats.org/markup-compatibility/2006" xmlns:r="http://schemas.openxmlformats.org/officeDocument/2006/relationships" xmlns:w="http://schemas.openxmlformats.org/wordprocessingml/2006/main" xmlns:w14="http://schemas.microsoft.com/office/word/2010/wordml" xmlns:w15="http://schemas.microsoft.com/office/word/2012/wordml" xmlns:w16cex="http://schemas.microsoft.com/office/word/2018/wordml/cex" xmlns:w16cid="http://schemas.microsoft.com/office/word/2016/wordml/cid" xmlns:w16="http://schemas.microsoft.com/office/word/2018/wordml" xmlns:w16du="http://schemas.microsoft.com/office/word/2023/wordml/word16du" xmlns:w16sdtdh="http://schemas.microsoft.com/office/word/2020/wordml/sdtdatahash" xmlns:w16sdtfl="http://schemas.microsoft.com/office/word/2024/wordml/sdtformatlock" xmlns:w16se="http://schemas.microsoft.com/office/word/2015/wordml/symex" mc:Ignorable="w14 w15 w16se w16cid w16 w16cex w16sdtdh w16sdtfl w16du">
   <w:docDefaults>
     <w:rPrDefault>
       <w:rPr>
@@ -6488,7 +6722,7 @@
       </w:pPr>
     </w:pPrDefault>
   </w:docDefaults>
-  <w:latentStyles w:defLockedState="0" w:defUIPriority="99" w:defSemiHidden="0" w:defUnhideWhenUsed="0" w:defQFormat="0" w:count="375">
+  <w:latentStyles w:defLockedState="0" w:defUIPriority="99" w:defSemiHidden="0" w:defUnhideWhenUsed="0" w:defQFormat="0" w:count="376">
     <w:lsdException w:name="Normal" w:uiPriority="0" w:qFormat="1"/>
     <w:lsdException w:name="heading 1" w:uiPriority="9" w:qFormat="1"/>
     <w:lsdException w:name="heading 2" w:semiHidden="1" w:uiPriority="9" w:unhideWhenUsed="1" w:qFormat="1"/>
@@ -6864,6 +7098,7 @@
     <w:lsdException w:name="Smart Hyperlink" w:semiHidden="1" w:unhideWhenUsed="1"/>
     <w:lsdException w:name="Hashtag" w:semiHidden="1" w:unhideWhenUsed="1"/>
     <w:lsdException w:name="Unresolved Mention" w:semiHidden="1" w:unhideWhenUsed="1"/>
+    <w:lsdException w:name="Smart Link" w:semiHidden="1" w:unhideWhenUsed="1"/>
   </w:latentStyles>
   <w:style w:type="paragraph" w:default="1" w:styleId="Normal">
     <w:name w:val="Normal"/>

</xml_diff>